<commit_message>
Some doc changes, todo and done
</commit_message>
<xml_diff>
--- a/CryptoScanBot/Help/CryptoScanBot.docx
+++ b/CryptoScanBot/Help/CryptoScanBot.docx
@@ -5764,6 +5764,9 @@
         <w:br/>
       </w:r>
       <w:r>
+        <w:rPr>
+          <w:noProof/>
+        </w:rPr>
         <w:lastRenderedPageBreak/>
         <w:drawing>
           <wp:anchor distT="0" distB="0" distL="114300" distR="114300" simplePos="0" relativeHeight="251724800" behindDoc="0" locked="0" layoutInCell="1" allowOverlap="1" wp14:anchorId="24775671" wp14:editId="7F7AE939">
@@ -6799,10 +6802,11 @@
       </w:pPr>
       <w:r>
         <w:rPr>
+          <w:noProof/>
           <w:lang w:val="nl-NL"/>
         </w:rPr>
         <w:drawing>
-          <wp:anchor distT="0" distB="0" distL="114300" distR="114300" simplePos="0" relativeHeight="251725824" behindDoc="0" locked="0" layoutInCell="1" allowOverlap="1" wp14:anchorId="6802DD9A" wp14:editId="6DE82FB3">
+          <wp:anchor distT="0" distB="0" distL="114300" distR="114300" simplePos="0" relativeHeight="251725824" behindDoc="0" locked="0" layoutInCell="1" allowOverlap="1" wp14:anchorId="6802DD9A" wp14:editId="592799DB">
             <wp:simplePos x="0" y="0"/>
             <wp:positionH relativeFrom="column">
               <wp:posOffset>3110</wp:posOffset>
@@ -7709,39 +7713,13 @@
           <w:iCs/>
           <w:lang w:val="nl-NL"/>
         </w:rPr>
-        <w:t>“</w:t>
-      </w:r>
-      <w:r>
-        <w:rPr>
-          <w:b/>
-          <w:bCs/>
-          <w:i/>
-          <w:iCs/>
-          <w:lang w:val="nl-NL"/>
-        </w:rPr>
-        <w:t>Double click action</w:t>
-      </w:r>
-      <w:r>
-        <w:rPr>
-          <w:b/>
-          <w:bCs/>
-          <w:i/>
-          <w:iCs/>
-          <w:lang w:val="nl-NL"/>
-        </w:rPr>
-        <w:t>”</w:t>
-      </w:r>
-      <w:r>
-        <w:rPr>
-          <w:lang w:val="nl-NL"/>
-        </w:rPr>
-        <w:t xml:space="preserve">: </w:t>
-      </w:r>
-      <w:r>
-        <w:rPr>
-          <w:lang w:val="nl-NL"/>
-        </w:rPr>
-        <w:t>Hiermee geef je aan welke actie je wi</w:t>
+        <w:t>“Double click action”</w:t>
+      </w:r>
+      <w:r>
+        <w:rPr>
+          <w:lang w:val="nl-NL"/>
+        </w:rPr>
+        <w:t>: Hiermee geef je aan welke actie je wi</w:t>
       </w:r>
       <w:r>
         <w:rPr>
@@ -9984,10 +9962,11 @@
       </w:pPr>
       <w:r>
         <w:rPr>
+          <w:noProof/>
           <w:lang w:val="nl-NL"/>
         </w:rPr>
         <w:drawing>
-          <wp:anchor distT="0" distB="0" distL="114300" distR="114300" simplePos="0" relativeHeight="251726848" behindDoc="0" locked="0" layoutInCell="1" allowOverlap="1" wp14:anchorId="6337A4EE" wp14:editId="167CE66C">
+          <wp:anchor distT="0" distB="0" distL="114300" distR="114300" simplePos="0" relativeHeight="251726848" behindDoc="0" locked="0" layoutInCell="1" allowOverlap="1" wp14:anchorId="6337A4EE" wp14:editId="4BF034D4">
             <wp:simplePos x="0" y="0"/>
             <wp:positionH relativeFrom="column">
               <wp:posOffset>3110</wp:posOffset>
@@ -10699,6 +10678,7 @@
       </w:pPr>
       <w:r>
         <w:rPr>
+          <w:noProof/>
           <w:lang w:val="nl-NL"/>
         </w:rPr>
         <w:drawing>
@@ -11217,32 +11197,24 @@
           <w:bCs/>
           <w:lang w:val="nl-NL"/>
         </w:rPr>
-        <w:t xml:space="preserve">Check </w:t>
-      </w:r>
+        <w:t xml:space="preserve">Check volume multiple </w:t>
+      </w:r>
+      <w:proofErr w:type="spellStart"/>
       <w:r>
         <w:rPr>
           <w:b/>
           <w:bCs/>
           <w:lang w:val="nl-NL"/>
         </w:rPr>
-        <w:t xml:space="preserve">volume multiple </w:t>
-      </w:r>
-      <w:proofErr w:type="spellStart"/>
+        <w:t>day’s</w:t>
+      </w:r>
+      <w:proofErr w:type="spellEnd"/>
       <w:r>
         <w:rPr>
           <w:b/>
           <w:bCs/>
           <w:lang w:val="nl-NL"/>
         </w:rPr>
-        <w:t>day’s</w:t>
-      </w:r>
-      <w:proofErr w:type="spellEnd"/>
-      <w:r>
-        <w:rPr>
-          <w:b/>
-          <w:bCs/>
-          <w:lang w:val="nl-NL"/>
-        </w:rPr>
         <w:t>”</w:t>
       </w:r>
       <w:r>
@@ -11255,13 +11227,7 @@
         <w:rPr>
           <w:lang w:val="nl-NL"/>
         </w:rPr>
-        <w:t xml:space="preserve"> Hiermee kun je de </w:t>
-      </w:r>
-      <w:r>
-        <w:rPr>
-          <w:lang w:val="nl-NL"/>
-        </w:rPr>
-        <w:t xml:space="preserve">volume controle over meerdere dagen uitvoeren. Wij zijn meestal alleen </w:t>
+        <w:t xml:space="preserve"> Hiermee kun je de volume controle over meerdere dagen uitvoeren. Wij zijn meestal alleen </w:t>
       </w:r>
       <w:proofErr w:type="spellStart"/>
       <w:r>
@@ -11275,25 +11241,7 @@
         <w:rPr>
           <w:lang w:val="nl-NL"/>
         </w:rPr>
-        <w:t xml:space="preserve"> in munten die consequent een bepaalde volume hebben</w:t>
-      </w:r>
-      <w:r>
-        <w:rPr>
-          <w:lang w:val="nl-NL"/>
-        </w:rPr>
-        <w:t xml:space="preserve">. Hiermee kun je munten die erg </w:t>
-      </w:r>
-      <w:r>
-        <w:rPr>
-          <w:lang w:val="nl-NL"/>
-        </w:rPr>
-        <w:t xml:space="preserve">tijdelijk hogere volume hebben </w:t>
-      </w:r>
-      <w:r>
-        <w:rPr>
-          <w:lang w:val="nl-NL"/>
-        </w:rPr>
-        <w:t xml:space="preserve">makkelijker detecteren. </w:t>
+        <w:t xml:space="preserve"> in munten die consequent een bepaalde volume hebben. Hiermee kun je munten die erg tijdelijk hogere volume hebben makkelijker detecteren. </w:t>
       </w:r>
     </w:p>
     <w:p>
@@ -12225,7 +12173,7 @@
           <w:lang w:val="nl-NL"/>
         </w:rPr>
         <w:drawing>
-          <wp:anchor distT="0" distB="0" distL="114300" distR="114300" simplePos="0" relativeHeight="251707392" behindDoc="1" locked="0" layoutInCell="1" allowOverlap="1" wp14:anchorId="4CABF7E8" wp14:editId="64C02743">
+          <wp:anchor distT="0" distB="0" distL="114300" distR="114300" simplePos="0" relativeHeight="251707392" behindDoc="1" locked="0" layoutInCell="1" allowOverlap="1" wp14:anchorId="4CABF7E8" wp14:editId="32A70178">
             <wp:simplePos x="0" y="0"/>
             <wp:positionH relativeFrom="column">
               <wp:posOffset>2805</wp:posOffset>
@@ -13113,7 +13061,7 @@
           <w:lang w:val="nl-NL"/>
         </w:rPr>
         <w:drawing>
-          <wp:anchor distT="0" distB="0" distL="114300" distR="114300" simplePos="0" relativeHeight="251714560" behindDoc="1" locked="0" layoutInCell="1" allowOverlap="1" wp14:anchorId="5F91DD4A" wp14:editId="1E48AA76">
+          <wp:anchor distT="0" distB="0" distL="114300" distR="114300" simplePos="0" relativeHeight="251714560" behindDoc="1" locked="0" layoutInCell="1" allowOverlap="1" wp14:anchorId="5F91DD4A" wp14:editId="6D2EACC5">
             <wp:simplePos x="0" y="0"/>
             <wp:positionH relativeFrom="column">
               <wp:posOffset>2805</wp:posOffset>
@@ -13243,7 +13191,7 @@
           <w:lang w:val="nl-NL"/>
         </w:rPr>
         <w:drawing>
-          <wp:anchor distT="0" distB="0" distL="114300" distR="114300" simplePos="0" relativeHeight="251715584" behindDoc="1" locked="0" layoutInCell="1" allowOverlap="1" wp14:anchorId="5356260D" wp14:editId="2474575F">
+          <wp:anchor distT="0" distB="0" distL="114300" distR="114300" simplePos="0" relativeHeight="251715584" behindDoc="1" locked="0" layoutInCell="1" allowOverlap="1" wp14:anchorId="5356260D" wp14:editId="779012D0">
             <wp:simplePos x="0" y="0"/>
             <wp:positionH relativeFrom="column">
               <wp:posOffset>2805</wp:posOffset>
@@ -14868,7 +14816,7 @@
           <w:lang w:val="nl-NL"/>
         </w:rPr>
         <w:drawing>
-          <wp:anchor distT="0" distB="0" distL="114300" distR="114300" simplePos="0" relativeHeight="251716608" behindDoc="1" locked="0" layoutInCell="1" allowOverlap="1" wp14:anchorId="37BC82F7" wp14:editId="19BA8B07">
+          <wp:anchor distT="0" distB="0" distL="114300" distR="114300" simplePos="0" relativeHeight="251716608" behindDoc="1" locked="0" layoutInCell="1" allowOverlap="1" wp14:anchorId="37BC82F7" wp14:editId="70B1FEFD">
             <wp:simplePos x="0" y="0"/>
             <wp:positionH relativeFrom="column">
               <wp:posOffset>2805</wp:posOffset>
@@ -16479,11 +16427,12 @@
       </w:pPr>
       <w:r>
         <w:rPr>
+          <w:noProof/>
           <w:lang w:val="nl-NL"/>
         </w:rPr>
         <w:lastRenderedPageBreak/>
         <w:drawing>
-          <wp:anchor distT="0" distB="0" distL="114300" distR="114300" simplePos="0" relativeHeight="251729920" behindDoc="0" locked="0" layoutInCell="1" allowOverlap="1" wp14:anchorId="2356C7B0" wp14:editId="1F65911E">
+          <wp:anchor distT="0" distB="0" distL="114300" distR="114300" simplePos="0" relativeHeight="251729920" behindDoc="0" locked="0" layoutInCell="1" allowOverlap="1" wp14:anchorId="2356C7B0" wp14:editId="1832D214">
             <wp:simplePos x="0" y="0"/>
             <wp:positionH relativeFrom="margin">
               <wp:align>left</wp:align>
@@ -16542,10 +16491,11 @@
       </w:r>
       <w:r>
         <w:rPr>
+          <w:noProof/>
           <w:lang w:val="nl-NL"/>
         </w:rPr>
         <w:drawing>
-          <wp:anchor distT="0" distB="0" distL="114300" distR="114300" simplePos="0" relativeHeight="251728896" behindDoc="0" locked="0" layoutInCell="1" allowOverlap="1" wp14:anchorId="158FA64A" wp14:editId="67E6E17E">
+          <wp:anchor distT="0" distB="0" distL="114300" distR="114300" simplePos="0" relativeHeight="251728896" behindDoc="0" locked="0" layoutInCell="1" allowOverlap="1" wp14:anchorId="158FA64A" wp14:editId="45242F2E">
             <wp:simplePos x="0" y="0"/>
             <wp:positionH relativeFrom="column">
               <wp:posOffset>2540</wp:posOffset>
@@ -16987,6 +16937,7 @@
       </w:pPr>
       <w:r>
         <w:rPr>
+          <w:noProof/>
           <w:lang w:val="nl-NL"/>
         </w:rPr>
         <w:drawing>
@@ -17205,6 +17156,7 @@
         <w:rPr>
           <w:i/>
           <w:iCs/>
+          <w:noProof/>
           <w:lang w:val="nl-NL"/>
         </w:rPr>
         <w:drawing>
@@ -17373,19 +17325,7 @@
         <w:rPr>
           <w:lang w:val="nl-NL"/>
         </w:rPr>
-        <w:t xml:space="preserve">ne moet niet te groot en niet te klein zijn. Volgens de </w:t>
-      </w:r>
-      <w:r>
-        <w:rPr>
-          <w:lang w:val="nl-NL"/>
-        </w:rPr>
-        <w:t xml:space="preserve">theorie </w:t>
-      </w:r>
-      <w:r>
-        <w:rPr>
-          <w:lang w:val="nl-NL"/>
-        </w:rPr>
-        <w:t xml:space="preserve">van </w:t>
+        <w:t xml:space="preserve">ne moet niet te groot en niet te klein zijn. Volgens de theorie van </w:t>
       </w:r>
       <w:proofErr w:type="spellStart"/>
       <w:r>
@@ -17528,13 +17468,7 @@
         <w:rPr>
           <w:lang w:val="nl-NL"/>
         </w:rPr>
-        <w:t xml:space="preserve">candles </w:t>
-      </w:r>
-      <w:r>
-        <w:rPr>
-          <w:lang w:val="nl-NL"/>
-        </w:rPr>
-        <w:t xml:space="preserve">worden </w:t>
+        <w:t xml:space="preserve">candles worden </w:t>
       </w:r>
       <w:r>
         <w:rPr>
@@ -17578,13 +17512,7 @@
         <w:rPr>
           <w:lang w:val="nl-NL"/>
         </w:rPr>
-        <w:t xml:space="preserve"> </w:t>
-      </w:r>
-      <w:r>
-        <w:rPr>
-          <w:lang w:val="nl-NL"/>
-        </w:rPr>
-        <w:t xml:space="preserve">berekend. </w:t>
+        <w:t xml:space="preserve"> berekend. </w:t>
       </w:r>
       <w:r>
         <w:rPr>
@@ -17678,6 +17606,7 @@
       </w:pPr>
       <w:r>
         <w:rPr>
+          <w:noProof/>
           <w:lang w:val="nl-NL"/>
         </w:rPr>
         <w:drawing>
@@ -17832,13 +17761,7 @@
         <w:rPr>
           <w:lang w:val="nl-NL"/>
         </w:rPr>
-        <w:t xml:space="preserve">ne moet niet te klein zijn. </w:t>
-      </w:r>
-      <w:r>
-        <w:rPr>
-          <w:lang w:val="nl-NL"/>
-        </w:rPr>
-        <w:t>Hier is een betrekkelijk grote 0.6% gekozen. Het moet zeker geen kleine percentages zijn omdat je dan overspoeld wordt met willekeurige FVG zones.</w:t>
+        <w:t>ne moet niet te klein zijn. Hier is een betrekkelijk grote 0.6% gekozen. Het moet zeker geen kleine percentages zijn omdat je dan overspoeld wordt met willekeurige FVG zones.</w:t>
       </w:r>
     </w:p>
     <w:p>
@@ -20467,6 +20390,7 @@
       </w:pPr>
       <w:r>
         <w:rPr>
+          <w:noProof/>
           <w:lang w:val="nl-NL"/>
         </w:rPr>
         <w:drawing>
@@ -22784,7 +22708,7 @@
           <w:lang w:val="nl-NL"/>
         </w:rPr>
         <w:drawing>
-          <wp:anchor distT="0" distB="0" distL="114300" distR="114300" simplePos="0" relativeHeight="251720704" behindDoc="1" locked="0" layoutInCell="1" allowOverlap="1" wp14:anchorId="5016B540" wp14:editId="42999A20">
+          <wp:anchor distT="0" distB="0" distL="114300" distR="114300" simplePos="0" relativeHeight="251720704" behindDoc="1" locked="0" layoutInCell="1" allowOverlap="1" wp14:anchorId="5016B540" wp14:editId="1278F38D">
             <wp:simplePos x="0" y="0"/>
             <wp:positionH relativeFrom="column">
               <wp:posOffset>2805</wp:posOffset>
@@ -28609,102 +28533,85 @@
           <w:rFonts w:ascii="Courier New" w:hAnsi="Courier New" w:cs="Courier New"/>
           <w:sz w:val="16"/>
           <w:szCs w:val="16"/>
-          <w:lang w:val="nl-NL"/>
-        </w:rPr>
-      </w:pPr>
-      <w:proofErr w:type="spellStart"/>
+        </w:rPr>
+      </w:pPr>
       <w:r>
         <w:rPr>
           <w:rFonts w:ascii="Courier New" w:hAnsi="Courier New" w:cs="Courier New"/>
           <w:sz w:val="16"/>
           <w:szCs w:val="16"/>
-          <w:lang w:val="nl-NL"/>
-        </w:rPr>
-        <w:t>Bybit</w:t>
-      </w:r>
-      <w:proofErr w:type="spellEnd"/>
+        </w:rPr>
+        <w:t>b</w:t>
+      </w:r>
       <w:r>
         <w:rPr>
           <w:rFonts w:ascii="Courier New" w:hAnsi="Courier New" w:cs="Courier New"/>
           <w:sz w:val="16"/>
           <w:szCs w:val="16"/>
-          <w:lang w:val="nl-NL"/>
-        </w:rPr>
-        <w:t xml:space="preserve"> USDT (</w:t>
-      </w:r>
-      <w:proofErr w:type="spellStart"/>
+        </w:rPr>
+        <w:t>ybit</w:t>
+      </w:r>
       <w:r>
         <w:rPr>
           <w:rFonts w:ascii="Courier New" w:hAnsi="Courier New" w:cs="Courier New"/>
           <w:sz w:val="16"/>
           <w:szCs w:val="16"/>
-          <w:lang w:val="nl-NL"/>
-        </w:rPr>
-        <w:t>ChainType</w:t>
-      </w:r>
-      <w:proofErr w:type="spellEnd"/>
+        </w:rPr>
+        <w:t>.eu</w:t>
+      </w:r>
       <w:r>
         <w:rPr>
           <w:rFonts w:ascii="Courier New" w:hAnsi="Courier New" w:cs="Courier New"/>
           <w:sz w:val="16"/>
           <w:szCs w:val="16"/>
-          <w:lang w:val="nl-NL"/>
-        </w:rPr>
-        <w:t xml:space="preserve"> trc20):</w:t>
-      </w:r>
-    </w:p>
-    <w:p>
-      <w:pPr>
-        <w:pStyle w:val="NoSpacing"/>
+        </w:rPr>
+        <w:t xml:space="preserve"> USDT (</w:t>
+      </w:r>
+      <w:proofErr w:type="spellStart"/>
+      <w:r>
         <w:rPr>
           <w:rFonts w:ascii="Courier New" w:hAnsi="Courier New" w:cs="Courier New"/>
           <w:sz w:val="16"/>
           <w:szCs w:val="16"/>
-          <w:lang w:val="nl-NL"/>
-        </w:rPr>
-      </w:pPr>
+        </w:rPr>
+        <w:t>ChainType</w:t>
+      </w:r>
+      <w:proofErr w:type="spellEnd"/>
       <w:r>
         <w:rPr>
           <w:rFonts w:ascii="Courier New" w:hAnsi="Courier New" w:cs="Courier New"/>
           <w:sz w:val="16"/>
           <w:szCs w:val="16"/>
-          <w:lang w:val="nl-NL"/>
-        </w:rPr>
-        <w:t>TAMBxx5YraPS6Ydr2upa1Fu2tgGygm8p3j</w:t>
-      </w:r>
-    </w:p>
-    <w:p>
-      <w:pPr>
-        <w:pStyle w:val="NoSpacing"/>
+        </w:rPr>
+        <w:t xml:space="preserve"> </w:t>
+      </w:r>
+      <w:r>
         <w:rPr>
           <w:rFonts w:ascii="Courier New" w:hAnsi="Courier New" w:cs="Courier New"/>
           <w:sz w:val="16"/>
           <w:szCs w:val="16"/>
-          <w:lang w:val="nl-NL"/>
-        </w:rPr>
-      </w:pPr>
-    </w:p>
-    <w:p>
-      <w:pPr>
-        <w:pStyle w:val="NoSpacing"/>
+        </w:rPr>
+        <w:t>er</w:t>
+      </w:r>
+      <w:r>
         <w:rPr>
           <w:rFonts w:ascii="Courier New" w:hAnsi="Courier New" w:cs="Courier New"/>
           <w:sz w:val="16"/>
           <w:szCs w:val="16"/>
-          <w:lang w:val="nl-NL"/>
-        </w:rPr>
-      </w:pPr>
-      <w:proofErr w:type="spellStart"/>
-      <w:r>
+        </w:rPr>
+        <w:t>c20):</w:t>
+      </w:r>
+    </w:p>
+    <w:p>
+      <w:pPr>
+        <w:pStyle w:val="NoSpacing"/>
         <w:rPr>
           <w:rFonts w:ascii="Courier New" w:hAnsi="Courier New" w:cs="Courier New"/>
           <w:sz w:val="16"/>
           <w:szCs w:val="16"/>
           <w:lang w:val="nl-NL"/>
         </w:rPr>
-        <w:t>Bybit</w:t>
-      </w:r>
-      <w:proofErr w:type="spellEnd"/>
+      </w:pPr>
       <w:r>
         <w:rPr>
           <w:rFonts w:ascii="Courier New" w:hAnsi="Courier New" w:cs="Courier New"/>
@@ -28712,88 +28619,79 @@
           <w:szCs w:val="16"/>
           <w:lang w:val="nl-NL"/>
         </w:rPr>
-        <w:t xml:space="preserve"> XRP (</w:t>
-      </w:r>
-      <w:proofErr w:type="spellStart"/>
-      <w:r>
+        <w:t>0x4ee0fc1bdbd83ee968b57f2f5c96363cb47f80f7</w:t>
+      </w:r>
+    </w:p>
+    <w:p>
+      <w:pPr>
+        <w:pStyle w:val="NoSpacing"/>
         <w:rPr>
           <w:rFonts w:ascii="Courier New" w:hAnsi="Courier New" w:cs="Courier New"/>
           <w:sz w:val="16"/>
           <w:szCs w:val="16"/>
           <w:lang w:val="nl-NL"/>
         </w:rPr>
-        <w:t>ChainType</w:t>
-      </w:r>
-      <w:proofErr w:type="spellEnd"/>
-      <w:r>
+      </w:pPr>
+    </w:p>
+    <w:p>
+      <w:pPr>
+        <w:pStyle w:val="NoSpacing"/>
         <w:rPr>
           <w:rFonts w:ascii="Courier New" w:hAnsi="Courier New" w:cs="Courier New"/>
           <w:sz w:val="16"/>
           <w:szCs w:val="16"/>
-          <w:lang w:val="nl-NL"/>
-        </w:rPr>
-        <w:t xml:space="preserve"> XRP):</w:t>
-      </w:r>
-    </w:p>
-    <w:p>
-      <w:pPr>
-        <w:pStyle w:val="NoSpacing"/>
+        </w:rPr>
+      </w:pPr>
+      <w:r>
         <w:rPr>
           <w:rFonts w:ascii="Courier New" w:hAnsi="Courier New" w:cs="Courier New"/>
           <w:sz w:val="16"/>
           <w:szCs w:val="16"/>
-          <w:lang w:val="nl-NL"/>
-        </w:rPr>
-      </w:pPr>
+        </w:rPr>
+        <w:t>B</w:t>
+      </w:r>
       <w:r>
         <w:rPr>
           <w:rFonts w:ascii="Courier New" w:hAnsi="Courier New" w:cs="Courier New"/>
           <w:sz w:val="16"/>
           <w:szCs w:val="16"/>
-          <w:lang w:val="nl-NL"/>
-        </w:rPr>
-        <w:t>rJn2zAPdFA193sixJwuFixRkYDUtx3apQh</w:t>
-      </w:r>
-    </w:p>
-    <w:p>
-      <w:pPr>
-        <w:pStyle w:val="NoSpacing"/>
+        </w:rPr>
+        <w:t>ybit</w:t>
+      </w:r>
+      <w:r>
         <w:rPr>
           <w:rFonts w:ascii="Courier New" w:hAnsi="Courier New" w:cs="Courier New"/>
           <w:sz w:val="16"/>
           <w:szCs w:val="16"/>
-          <w:lang w:val="nl-NL"/>
-        </w:rPr>
-      </w:pPr>
+        </w:rPr>
+        <w:t>.eu</w:t>
+      </w:r>
       <w:r>
         <w:rPr>
           <w:rFonts w:ascii="Courier New" w:hAnsi="Courier New" w:cs="Courier New"/>
           <w:sz w:val="16"/>
           <w:szCs w:val="16"/>
-          <w:lang w:val="nl-NL"/>
-        </w:rPr>
-        <w:t>memo/t</w:t>
-      </w:r>
+        </w:rPr>
+        <w:t xml:space="preserve"> XRP (</w:t>
+      </w:r>
+      <w:proofErr w:type="spellStart"/>
       <w:r>
         <w:rPr>
           <w:rFonts w:ascii="Courier New" w:hAnsi="Courier New" w:cs="Courier New"/>
           <w:sz w:val="16"/>
           <w:szCs w:val="16"/>
-          <w:lang w:val="nl-NL"/>
-        </w:rPr>
-        <w:t>ag=500094040</w:t>
-      </w:r>
-    </w:p>
-    <w:p>
-      <w:pPr>
-        <w:pStyle w:val="NoSpacing"/>
+        </w:rPr>
+        <w:t>ChainType</w:t>
+      </w:r>
+      <w:proofErr w:type="spellEnd"/>
+      <w:r>
         <w:rPr>
           <w:rFonts w:ascii="Courier New" w:hAnsi="Courier New" w:cs="Courier New"/>
           <w:sz w:val="16"/>
           <w:szCs w:val="16"/>
-          <w:lang w:val="nl-NL"/>
-        </w:rPr>
-      </w:pPr>
+        </w:rPr>
+        <w:t xml:space="preserve"> XRP):</w:t>
+      </w:r>
     </w:p>
     <w:p>
       <w:pPr>
@@ -28802,88 +28700,149 @@
           <w:rFonts w:ascii="Courier New" w:hAnsi="Courier New" w:cs="Courier New"/>
           <w:sz w:val="16"/>
           <w:szCs w:val="16"/>
-          <w:lang w:val="nl-NL"/>
-        </w:rPr>
-      </w:pPr>
-      <w:proofErr w:type="spellStart"/>
+        </w:rPr>
+      </w:pPr>
       <w:r>
         <w:rPr>
           <w:rFonts w:ascii="Courier New" w:hAnsi="Courier New" w:cs="Courier New"/>
           <w:sz w:val="16"/>
           <w:szCs w:val="16"/>
-          <w:lang w:val="nl-NL"/>
-        </w:rPr>
-        <w:t>Bybit</w:t>
-      </w:r>
-      <w:proofErr w:type="spellEnd"/>
-      <w:r>
+        </w:rPr>
+        <w:t>r9nhTUa3gsa9LEd94adCzEjezWVxKCCRe4</w:t>
+      </w:r>
+    </w:p>
+    <w:p>
+      <w:pPr>
+        <w:pStyle w:val="NoSpacing"/>
         <w:rPr>
           <w:rFonts w:ascii="Courier New" w:hAnsi="Courier New" w:cs="Courier New"/>
           <w:sz w:val="16"/>
           <w:szCs w:val="16"/>
-          <w:lang w:val="nl-NL"/>
-        </w:rPr>
-        <w:t xml:space="preserve"> BTC (</w:t>
-      </w:r>
-      <w:proofErr w:type="spellStart"/>
+        </w:rPr>
+      </w:pPr>
       <w:r>
         <w:rPr>
           <w:rFonts w:ascii="Courier New" w:hAnsi="Courier New" w:cs="Courier New"/>
           <w:sz w:val="16"/>
           <w:szCs w:val="16"/>
-          <w:lang w:val="nl-NL"/>
-        </w:rPr>
-        <w:t>ChainType</w:t>
-      </w:r>
-      <w:proofErr w:type="spellEnd"/>
+        </w:rPr>
+        <w:t>memo/tag=</w:t>
+      </w:r>
       <w:r>
         <w:rPr>
           <w:rFonts w:ascii="Courier New" w:hAnsi="Courier New" w:cs="Courier New"/>
           <w:sz w:val="16"/>
           <w:szCs w:val="16"/>
-          <w:lang w:val="nl-NL"/>
-        </w:rPr>
-        <w:t xml:space="preserve"> </w:t>
-      </w:r>
-      <w:proofErr w:type="spellStart"/>
-      <w:r>
+        </w:rPr>
+        <w:t>502450250</w:t>
+      </w:r>
+    </w:p>
+    <w:p>
+      <w:pPr>
+        <w:pStyle w:val="NoSpacing"/>
         <w:rPr>
           <w:rFonts w:ascii="Courier New" w:hAnsi="Courier New" w:cs="Courier New"/>
           <w:sz w:val="16"/>
           <w:szCs w:val="16"/>
-          <w:lang w:val="nl-NL"/>
-        </w:rPr>
-        <w:t>btc</w:t>
-      </w:r>
-      <w:proofErr w:type="spellEnd"/>
-      <w:r>
+        </w:rPr>
+      </w:pPr>
+    </w:p>
+    <w:p>
+      <w:pPr>
+        <w:pStyle w:val="NoSpacing"/>
         <w:rPr>
           <w:rFonts w:ascii="Courier New" w:hAnsi="Courier New" w:cs="Courier New"/>
           <w:sz w:val="16"/>
           <w:szCs w:val="16"/>
-          <w:lang w:val="nl-NL"/>
-        </w:rPr>
-        <w:t>):</w:t>
-      </w:r>
-    </w:p>
-    <w:p>
-      <w:pPr>
-        <w:pStyle w:val="NoSpacing"/>
+        </w:rPr>
+      </w:pPr>
+      <w:r>
         <w:rPr>
           <w:rFonts w:ascii="Courier New" w:hAnsi="Courier New" w:cs="Courier New"/>
           <w:sz w:val="16"/>
           <w:szCs w:val="16"/>
-          <w:lang w:val="nl-NL"/>
-        </w:rPr>
-      </w:pPr>
+        </w:rPr>
+        <w:t>b</w:t>
+      </w:r>
       <w:r>
         <w:rPr>
           <w:rFonts w:ascii="Courier New" w:hAnsi="Courier New" w:cs="Courier New"/>
           <w:sz w:val="16"/>
           <w:szCs w:val="16"/>
-          <w:lang w:val="nl-NL"/>
-        </w:rPr>
-        <w:t>1BteenJnv6GM6HejcfBLxHLxQwBo1Ydf5h</w:t>
+        </w:rPr>
+        <w:t>ybit</w:t>
+      </w:r>
+      <w:r>
+        <w:rPr>
+          <w:rFonts w:ascii="Courier New" w:hAnsi="Courier New" w:cs="Courier New"/>
+          <w:sz w:val="16"/>
+          <w:szCs w:val="16"/>
+        </w:rPr>
+        <w:t>.eu</w:t>
+      </w:r>
+      <w:r>
+        <w:rPr>
+          <w:rFonts w:ascii="Courier New" w:hAnsi="Courier New" w:cs="Courier New"/>
+          <w:sz w:val="16"/>
+          <w:szCs w:val="16"/>
+        </w:rPr>
+        <w:t xml:space="preserve"> BTC (</w:t>
+      </w:r>
+      <w:proofErr w:type="spellStart"/>
+      <w:r>
+        <w:rPr>
+          <w:rFonts w:ascii="Courier New" w:hAnsi="Courier New" w:cs="Courier New"/>
+          <w:sz w:val="16"/>
+          <w:szCs w:val="16"/>
+        </w:rPr>
+        <w:t>ChainType</w:t>
+      </w:r>
+      <w:proofErr w:type="spellEnd"/>
+      <w:r>
+        <w:rPr>
+          <w:rFonts w:ascii="Courier New" w:hAnsi="Courier New" w:cs="Courier New"/>
+          <w:sz w:val="16"/>
+          <w:szCs w:val="16"/>
+        </w:rPr>
+        <w:t xml:space="preserve"> </w:t>
+      </w:r>
+      <w:proofErr w:type="spellStart"/>
+      <w:r>
+        <w:rPr>
+          <w:rFonts w:ascii="Courier New" w:hAnsi="Courier New" w:cs="Courier New"/>
+          <w:sz w:val="16"/>
+          <w:szCs w:val="16"/>
+        </w:rPr>
+        <w:t>btc</w:t>
+      </w:r>
+      <w:proofErr w:type="spellEnd"/>
+      <w:r>
+        <w:rPr>
+          <w:rFonts w:ascii="Courier New" w:hAnsi="Courier New" w:cs="Courier New"/>
+          <w:sz w:val="16"/>
+          <w:szCs w:val="16"/>
+        </w:rPr>
+        <w:t>):</w:t>
+      </w:r>
+    </w:p>
+    <w:p>
+      <w:pPr>
+        <w:pStyle w:val="NoSpacing"/>
+        <w:rPr>
+          <w:rFonts w:ascii="Courier New" w:hAnsi="Courier New" w:cs="Courier New"/>
+          <w:sz w:val="16"/>
+          <w:szCs w:val="16"/>
+          <w:lang w:val="nl-NL"/>
+        </w:rPr>
+      </w:pPr>
+      <w:r>
+        <w:rPr>
+          <w:rFonts w:ascii="Courier New" w:hAnsi="Courier New" w:cs="Courier New"/>
+          <w:sz w:val="16"/>
+          <w:szCs w:val="16"/>
+          <w:lang w:val="nl-NL"/>
+        </w:rPr>
+        <w:t>13Z3HSzaMJXNvbB9KagfcJTocpdNNJGdf1</w:t>
       </w:r>
     </w:p>
     <w:p>
@@ -32707,7 +32666,6 @@
   <w:style w:type="character" w:default="1" w:styleId="DefaultParagraphFont">
     <w:name w:val="Default Paragraph Font"/>
     <w:uiPriority w:val="1"/>
-    <w:semiHidden/>
     <w:unhideWhenUsed/>
   </w:style>
   <w:style w:type="table" w:default="1" w:styleId="TableNormal">

</xml_diff>